<commit_message>
docs: figuras del entregable y nuevo anexo de uso de IA
Co-Authored-By: Claude Opus 5.5 <noreply@anthropic.com>
</commit_message>
<xml_diff>
--- a/docs/entregas/OneRM - Etapa 1 - Preentrega.docx
+++ b/docs/entregas/OneRM - Etapa 1 - Preentrega.docx
@@ -12798,7 +12798,201 @@
           <w:sz w:val="24"/>
           <w:szCs w:val="24"/>
         </w:rPr>
-        <w:t xml:space="preserve">Se usan asistentes de IA para consulta, revisión de la especificación y apoyo en la redacción y el código. Toda decisión y todo fragmento incorporado se revisa y se puede explicar en la defensa. Las justificaciones técnicas de este documento se basan en el problema y el contexto de uso, no en la respuesta de una herramienta.</w:t>
+        <w:t xml:space="preserve">La inteligencia artificial se usó como asistente durante el análisis y el diseño. Las decisiones de producto partieron siempre del autor, y la IA ayudó a refinarlas, cuestionarlas y documentarlas. El trabajo siguió estas etapas:</w:t>
+      </w:r>
+    </w:p>
+    <w:p>
+      <w:pPr>
+        <w:numPr>
+          <w:ilvl w:val="0"/>
+          <w:numId w:val="2"/>
+        </w:numPr>
+        <w:spacing w:line="360" w:lineRule="auto"/>
+        <w:ind w:left="720" w:hanging="360"/>
+        <w:jc w:val="both"/>
+      </w:pPr>
+      <w:r>
+        <w:rPr>
+          <w:rFonts w:ascii="Times New Roman" w:cs="Times New Roman" w:eastAsia="Times New Roman" w:hAnsi="Times New Roman"/>
+          <w:b w:val="1"/>
+          <w:bCs w:val="1"/>
+          <w:i w:val="0"/>
+          <w:iCs w:val="0"/>
+          <w:sz w:val="24"/>
+          <w:szCs w:val="24"/>
+        </w:rPr>
+        <w:t xml:space="preserve">Planteo del problema.</w:t>
+      </w:r>
+      <w:r>
+        <w:rPr>
+          <w:rFonts w:ascii="Times New Roman" w:cs="Times New Roman" w:eastAsia="Times New Roman" w:hAnsi="Times New Roman"/>
+          <w:b w:val="0"/>
+          <w:bCs w:val="0"/>
+          <w:i w:val="0"/>
+          <w:iCs w:val="0"/>
+          <w:sz w:val="24"/>
+          <w:szCs w:val="24"/>
+        </w:rPr>
+        <w:t xml:space="preserve"> El punto de partida fue la problemática y la idea de producto, formuladas por el autor antes de usar la IA.</w:t>
+      </w:r>
+    </w:p>
+    <w:p>
+      <w:pPr>
+        <w:numPr>
+          <w:ilvl w:val="0"/>
+          <w:numId w:val="2"/>
+        </w:numPr>
+        <w:spacing w:line="360" w:lineRule="auto"/>
+        <w:ind w:left="720" w:hanging="360"/>
+        <w:jc w:val="both"/>
+      </w:pPr>
+      <w:r>
+        <w:rPr>
+          <w:rFonts w:ascii="Times New Roman" w:cs="Times New Roman" w:eastAsia="Times New Roman" w:hAnsi="Times New Roman"/>
+          <w:b w:val="1"/>
+          <w:bCs w:val="1"/>
+          <w:i w:val="0"/>
+          <w:iCs w:val="0"/>
+          <w:sz w:val="24"/>
+          <w:szCs w:val="24"/>
+        </w:rPr>
+        <w:t xml:space="preserve">Elicitación de requisitos.</w:t>
+      </w:r>
+      <w:r>
+        <w:rPr>
+          <w:rFonts w:ascii="Times New Roman" w:cs="Times New Roman" w:eastAsia="Times New Roman" w:hAnsi="Times New Roman"/>
+          <w:b w:val="0"/>
+          <w:bCs w:val="0"/>
+          <w:i w:val="0"/>
+          <w:iCs w:val="0"/>
+          <w:sz w:val="24"/>
+          <w:szCs w:val="24"/>
+        </w:rPr>
+        <w:t xml:space="preserve"> Con asistencia de IA, la idea inicial se refinó mediante preguntas sucesivas sobre usuarios, contexto de uso, alcance y casos límite, hasta llegar a la especificación actual.</w:t>
+      </w:r>
+    </w:p>
+    <w:p>
+      <w:pPr>
+        <w:numPr>
+          <w:ilvl w:val="0"/>
+          <w:numId w:val="2"/>
+        </w:numPr>
+        <w:spacing w:line="360" w:lineRule="auto"/>
+        <w:ind w:left="720" w:hanging="360"/>
+        <w:jc w:val="both"/>
+      </w:pPr>
+      <w:r>
+        <w:rPr>
+          <w:rFonts w:ascii="Times New Roman" w:cs="Times New Roman" w:eastAsia="Times New Roman" w:hAnsi="Times New Roman"/>
+          <w:b w:val="1"/>
+          <w:bCs w:val="1"/>
+          <w:i w:val="0"/>
+          <w:iCs w:val="0"/>
+          <w:sz w:val="24"/>
+          <w:szCs w:val="24"/>
+        </w:rPr>
+        <w:t xml:space="preserve">Validación y verificación.</w:t>
+      </w:r>
+      <w:r>
+        <w:rPr>
+          <w:rFonts w:ascii="Times New Roman" w:cs="Times New Roman" w:eastAsia="Times New Roman" w:hAnsi="Times New Roman"/>
+          <w:b w:val="0"/>
+          <w:bCs w:val="0"/>
+          <w:i w:val="0"/>
+          <w:iCs w:val="0"/>
+          <w:sz w:val="24"/>
+          <w:szCs w:val="24"/>
+        </w:rPr>
+        <w:t xml:space="preserve"> Los requisitos, la especificación y los documentos pasaron por varias rondas de revisión con agentes jueces, que buscaron inconsistencias, ambigüedades y requisitos no verificables. Cada hallazgo se analizó y, cuando correspondía, se corrigió.</w:t>
+      </w:r>
+    </w:p>
+    <w:p>
+      <w:pPr>
+        <w:numPr>
+          <w:ilvl w:val="0"/>
+          <w:numId w:val="2"/>
+        </w:numPr>
+        <w:spacing w:line="360" w:lineRule="auto"/>
+        <w:ind w:left="720" w:hanging="360"/>
+        <w:jc w:val="both"/>
+      </w:pPr>
+      <w:r>
+        <w:rPr>
+          <w:rFonts w:ascii="Times New Roman" w:cs="Times New Roman" w:eastAsia="Times New Roman" w:hAnsi="Times New Roman"/>
+          <w:b w:val="1"/>
+          <w:bCs w:val="1"/>
+          <w:i w:val="0"/>
+          <w:iCs w:val="0"/>
+          <w:sz w:val="24"/>
+          <w:szCs w:val="24"/>
+        </w:rPr>
+        <w:t xml:space="preserve">Identidad visual.</w:t>
+      </w:r>
+      <w:r>
+        <w:rPr>
+          <w:rFonts w:ascii="Times New Roman" w:cs="Times New Roman" w:eastAsia="Times New Roman" w:hAnsi="Times New Roman"/>
+          <w:b w:val="0"/>
+          <w:bCs w:val="0"/>
+          <w:i w:val="0"/>
+          <w:iCs w:val="0"/>
+          <w:sz w:val="24"/>
+          <w:szCs w:val="24"/>
+        </w:rPr>
+        <w:t xml:space="preserve"> Se definió la identidad de la aplicación (colores, tipografía y tono), iterando sobre varias propuestas hasta llegar a la buscada.</w:t>
+      </w:r>
+    </w:p>
+    <w:p>
+      <w:pPr>
+        <w:numPr>
+          <w:ilvl w:val="0"/>
+          <w:numId w:val="2"/>
+        </w:numPr>
+        <w:spacing w:line="360" w:lineRule="auto"/>
+        <w:ind w:left="720" w:hanging="360"/>
+        <w:jc w:val="both"/>
+      </w:pPr>
+      <w:r>
+        <w:rPr>
+          <w:rFonts w:ascii="Times New Roman" w:cs="Times New Roman" w:eastAsia="Times New Roman" w:hAnsi="Times New Roman"/>
+          <w:b w:val="1"/>
+          <w:bCs w:val="1"/>
+          <w:i w:val="0"/>
+          <w:iCs w:val="0"/>
+          <w:sz w:val="24"/>
+          <w:szCs w:val="24"/>
+        </w:rPr>
+        <w:t xml:space="preserve">Diseño de pantallas y prototipo.</w:t>
+      </w:r>
+      <w:r>
+        <w:rPr>
+          <w:rFonts w:ascii="Times New Roman" w:cs="Times New Roman" w:eastAsia="Times New Roman" w:hAnsi="Times New Roman"/>
+          <w:b w:val="0"/>
+          <w:bCs w:val="0"/>
+          <w:i w:val="0"/>
+          <w:iCs w:val="0"/>
+          <w:sz w:val="24"/>
+          <w:szCs w:val="24"/>
+        </w:rPr>
+        <w:t xml:space="preserve"> Con la identidad definida, se diseñaron las pantallas en Figma y se armó el prototipo navegable.</w:t>
+      </w:r>
+    </w:p>
+    <w:p>
+      <w:pPr>
+        <w:spacing w:after="0" w:line="360" w:lineRule="auto"/>
+        <w:ind w:firstLine="708"/>
+        <w:jc w:val="both"/>
+      </w:pPr>
+      <w:r>
+        <w:rPr>
+          <w:rFonts w:ascii="Times New Roman" w:cs="Times New Roman" w:eastAsia="Times New Roman" w:hAnsi="Times New Roman"/>
+          <w:b w:val="0"/>
+          <w:bCs w:val="0"/>
+          <w:i w:val="0"/>
+          <w:iCs w:val="0"/>
+          <w:sz w:val="24"/>
+          <w:szCs w:val="24"/>
+        </w:rPr>
+        <w:t xml:space="preserve">Todo lo incorporado fue revisado y puede explicarse en la defensa. Las justificaciones técnicas de este documento se basan en el problema y en el contexto de uso, no en la respuesta de una herramienta.</w:t>
       </w:r>
     </w:p>
     <w:sectPr>

</xml_diff>